<commit_message>
c5 started working on interface (background)
</commit_message>
<xml_diff>
--- a/Documentatie (Romana).docx
+++ b/Documentatie (Romana).docx
@@ -62,7 +62,13 @@
         <w:jc w:val="both"/>
       </w:pPr>
       <w:r>
-        <w:t>Proiectul este organizat pe trei module principale. Modulul Client conține clasa ChatClient, care implementează logica clientului, inclusiv interfața grafică pentru utilizator și gestionarea conexiunii la server. Modulul Server include clasele ChatServer, ClientHandler și Message. Clasa ChatServer asigură gestionarea conexiunilor și coordonarea traficului de mesaje, ClientHandler gestionează conexiunea individuală cu fiecare client, iar Message reprezintă obiectul mesaj care este trimis între client și server. Modulul Utils include clasa SoundUtils, care oferă funcții pentru redarea notificărilor audio (ex. sunetul "meow").</w:t>
+        <w:t>Proiectul este organizat pe trei module principale. Modulul Client conține clasa ChatClient, care implementează logica clientului, inclusiv interfața grafică pentru utilizator și gestionarea conexiunii la server. Modulul Server include clasele ChatServer, ClientHandler și Message. Clasa ChatServer asigură gestionarea conexiunilor și coordonarea traficului de mesaje, ClientHandler gestionează conexiunea individuală cu fiecare client, iar Message reprezintă obiectul mesaj care este trimis între client și server. Modulul Utils include clasa SoundUtils, care oferă funcții pentru redarea notificărilor audio (ex. sunetul "meow"</w:t>
+      </w:r>
+      <w:r>
+        <w:t>, hiss</w:t>
+      </w:r>
+      <w:r>
+        <w:t>).</w:t>
       </w:r>
     </w:p>
     <w:p>
@@ -80,20 +86,74 @@
         <w:jc w:val="both"/>
       </w:pPr>
       <w:r>
-        <w:t>Clientul se conectează la server utilizând socketuri. După conectare, utilizatorului i se afișează o interfață grafică care include o zonă de chat pentru mesaje, o listă a utilizatorilor conectați, un câmp de text pentru introducerea mesajelor și un buton pentru trimiterea mesajelor. Mesajele trimise sunt afișate local cu prefixul "You: ...", în timp ce mesajele primite de la ceilalți utilizatori sunt afișate în zona de chat și sunt acompaniate de un sunet de notificare. La fiecare mesaj primit, aplicația redă un fișier audio.</w:t>
+        <w:t>Clientul se conectează la server utilizând socketuri. După conectare, utilizatorului i se afișează o interfață grafică care include o zonă de chat pentru mesaje, o listă a utilizatorilor conectați, un câmp de text pentru introducerea mesajelor și un buton pentru trimiterea mesajelor. De asemenea, clientul afișează un fundal grafic personalizat, utilizând clasa BackgroundPanel. Mesajele trimise sunt afișate local cu prefixul "You: ...", în timp ce mesajele primite de la ceilalți utilizatori sunt afișate în zona de chat și sunt acompaniate de un sunet de notificare. La fiecare mesaj primit, aplicația redă un fișier audio. Comanda specială Hiss, accesibilă printr-un buton dedicat, declanșează un sunet specific și afișează numele expeditorului în chat (ex. *HISS* from Alice).</w:t>
       </w:r>
     </w:p>
     <w:p>
       <w:pPr>
         <w:ind w:firstLine="720"/>
-        <w:jc w:val="both"/>
-      </w:pPr>
-      <w:r>
-        <w:t>Serverul ascultă conexiuni pe un port prestabilit (12345) și acceptă conexiuni multiple de la clienți folosind socketuri. Pentru fiecare client conectat, serverul creează un fir de execuție separat. Resursele partajate, precum lista de mesaje (“chatHistory”) și lista clienților conectați (“clientHandlers”), sunt sincronizate pentru a preveni accesul simultan conflictual. Mesajele primite de la un client sunt adăugate în istoricul de mesaje și transmise tuturor celorlalți clienți. De asemenea, istoricul conversațiilor este salvat într-un fișier serializat (“chat_history.ser”) și încărcat la pornirea serverului. Lista utilizatorilor conectați este actualizată periodic și transmisă tuturor clienților.</w:t>
+      </w:pPr>
+      <w:r>
+        <w:drawing>
+          <wp:inline distT="0" distB="0" distL="0" distR="0" wp14:anchorId="78588C43" wp14:editId="6492D097">
+            <wp:extent cx="3601091" cy="2433099"/>
+            <wp:effectExtent l="0" t="0" r="0" b="5715"/>
+            <wp:docPr id="60030727" name="Picture 1"/>
+            <wp:cNvGraphicFramePr>
+              <a:graphicFrameLocks xmlns:a="http://schemas.openxmlformats.org/drawingml/2006/main" noChangeAspect="1"/>
+            </wp:cNvGraphicFramePr>
+            <a:graphic xmlns:a="http://schemas.openxmlformats.org/drawingml/2006/main">
+              <a:graphicData uri="http://schemas.openxmlformats.org/drawingml/2006/picture">
+                <pic:pic xmlns:pic="http://schemas.openxmlformats.org/drawingml/2006/picture">
+                  <pic:nvPicPr>
+                    <pic:cNvPr id="60030727" name=""/>
+                    <pic:cNvPicPr/>
+                  </pic:nvPicPr>
+                  <pic:blipFill>
+                    <a:blip r:embed="rId7"/>
+                    <a:stretch>
+                      <a:fillRect/>
+                    </a:stretch>
+                  </pic:blipFill>
+                  <pic:spPr>
+                    <a:xfrm>
+                      <a:off x="0" y="0"/>
+                      <a:ext cx="3631082" cy="2453362"/>
+                    </a:xfrm>
+                    <a:prstGeom prst="rect">
+                      <a:avLst/>
+                    </a:prstGeom>
+                  </pic:spPr>
+                </pic:pic>
+              </a:graphicData>
+            </a:graphic>
+          </wp:inline>
+        </w:drawing>
       </w:r>
     </w:p>
     <w:p>
       <w:pPr>
+        <w:ind w:firstLine="720"/>
+        <w:jc w:val="both"/>
+        <w:rPr>
+          <w:b/>
+        </w:rPr>
+      </w:pPr>
+      <w:r>
+        <w:lastRenderedPageBreak/>
+        <w:t xml:space="preserve">Serverul ascultă conexiuni pe un port prestabilit (12345) și acceptă conexiuni multiple de la clienți folosind socketuri. Pentru fiecare client conectat, serverul creează un fir de execuție separat, permițând funcționarea simultană a mai multor utilizatori. Resursele partajate, precum lista de mesaje (chatHistory) și lista clienților conectați (clientHandlers), sunt sincronizate folosind blocuri synchronized pentru a preveni accesul simultan conflictual. În plus, comanda Hiss utilizează un mutex (hissLock) pentru </w:t>
+      </w:r>
+      <w:proofErr w:type="gramStart"/>
+      <w:r>
+        <w:t>a</w:t>
+      </w:r>
+      <w:proofErr w:type="gramEnd"/>
+      <w:r>
+        <w:t xml:space="preserve"> asigura că doar un client poate trimite comanda la un moment dat. Mesajele primite de la un client sunt adăugate în istoricul de mesaje și transmise tuturor celorlalți clienți. De asemenea, istoricul conversațiilor este salvat într-un fișier serializat (chat_history.ser) și încărcat automat la pornirea serverului. Lista utilizatorilor conectați este actualizată periodic și transmisă tuturor clienților.</w:t>
+      </w:r>
+    </w:p>
+    <w:p>
+      <w:pPr>
         <w:pStyle w:val="H1"/>
         <w:jc w:val="both"/>
       </w:pPr>
@@ -107,271 +167,593 @@
         <w:jc w:val="both"/>
       </w:pPr>
       <w:r>
-        <w:t>Fluxul general de execuție al aplicației este următorul. Serverul pornește și ascultă conexiuni pe portul prestabilit, încărcând istoricul conversațiilor, dacă acesta există. Un client se conectează la server, introduce numele de utilizator și primește confirmarea conectării și istoricul conversațiilor. Mesajele trimise de un client sunt transmise tuturor celorlalți utilizatori conectați, fiind salvate în istoricul conversațiilor pe server. La deconectarea unui client, serverul actualizează lista utilizatorilor conectați.</w:t>
+        <w:t xml:space="preserve">Fluxul general de execuție al aplicației este următorul. Serverul pornește și ascultă conexiuni pe portul prestabilit, încărcând istoricul conversațiilor, dacă acesta există. Un client se conectează la server, introduce numele de utilizator și primește confirmarea conectării și istoricul conversațiilor. Mesajele trimise de un client sunt transmise tuturor celorlalți utilizatori conectați, fiind salvate în istoricul conversațiilor pe server. Pentru a proteja accesul la resursele partajate, aplicația implementează </w:t>
+      </w:r>
+      <w:r>
+        <w:rPr>
+          <w:b/>
+          <w:bCs/>
+        </w:rPr>
+        <w:t>programare concurentă</w:t>
+      </w:r>
+      <w:r>
+        <w:t xml:space="preserve">: listele partajate sunt sincronizate, iar comanda Hiss este gestionată printr-un </w:t>
+      </w:r>
+      <w:r>
+        <w:rPr>
+          <w:b/>
+          <w:bCs/>
+        </w:rPr>
+        <w:t>mutex</w:t>
+      </w:r>
+      <w:r>
+        <w:t xml:space="preserve"> pentru </w:t>
+      </w:r>
+      <w:proofErr w:type="gramStart"/>
+      <w:r>
+        <w:t>a</w:t>
+      </w:r>
+      <w:proofErr w:type="gramEnd"/>
+      <w:r>
+        <w:t xml:space="preserve"> evita interferențele. La deconectarea unui client, serverul actualizează lista utilizatorilor conectați, notificând toți ceilalți clienți.</w:t>
       </w:r>
     </w:p>
     <w:p>
       <w:pPr>
+        <w:pStyle w:val="H1"/>
         <w:jc w:val="both"/>
       </w:pPr>
+      <w:r>
+        <w:t>5. Exemple de cod relevante</w:t>
+      </w:r>
     </w:p>
     <w:p>
       <w:pPr>
+        <w:pStyle w:val="ListParagraph"/>
+        <w:numPr>
+          <w:ilvl w:val="0"/>
+          <w:numId w:val="9"/>
+        </w:numPr>
+        <w:jc w:val="both"/>
+        <w:rPr>
+          <w:szCs w:val="24"/>
+        </w:rPr>
+      </w:pPr>
+      <w:r>
+        <w:rPr>
+          <w:szCs w:val="24"/>
+        </w:rPr>
+        <w:t xml:space="preserve">Conectarea unui client la </w:t>
+      </w:r>
+      <w:proofErr w:type="gramStart"/>
+      <w:r>
+        <w:rPr>
+          <w:szCs w:val="24"/>
+        </w:rPr>
+        <w:t>server</w:t>
+      </w:r>
+      <w:r>
+        <w:rPr>
+          <w:szCs w:val="24"/>
+        </w:rPr>
+        <w:t>:</w:t>
+      </w:r>
+      <w:r>
+        <w:rPr>
+          <w:szCs w:val="24"/>
+        </w:rPr>
+        <w:t>Atunci</w:t>
+      </w:r>
+      <w:proofErr w:type="gramEnd"/>
+      <w:r>
+        <w:rPr>
+          <w:szCs w:val="24"/>
+        </w:rPr>
+        <w:t xml:space="preserve"> când clientul este lansat, acesta creează o conexiune către server folosind un socket.</w:t>
+      </w:r>
+      <w:r>
+        <w:rPr>
+          <w:noProof/>
+        </w:rPr>
+        <w:t xml:space="preserve"> </w:t>
+      </w:r>
+      <w:r>
+        <w:rPr>
+          <w:szCs w:val="24"/>
+        </w:rPr>
+        <w:drawing>
+          <wp:inline distT="0" distB="0" distL="0" distR="0" wp14:anchorId="39A2CAAA" wp14:editId="1C9235E4">
+            <wp:extent cx="5943600" cy="2313940"/>
+            <wp:effectExtent l="0" t="0" r="0" b="0"/>
+            <wp:docPr id="156460100" name="Picture 1"/>
+            <wp:cNvGraphicFramePr>
+              <a:graphicFrameLocks xmlns:a="http://schemas.openxmlformats.org/drawingml/2006/main" noChangeAspect="1"/>
+            </wp:cNvGraphicFramePr>
+            <a:graphic xmlns:a="http://schemas.openxmlformats.org/drawingml/2006/main">
+              <a:graphicData uri="http://schemas.openxmlformats.org/drawingml/2006/picture">
+                <pic:pic xmlns:pic="http://schemas.openxmlformats.org/drawingml/2006/picture">
+                  <pic:nvPicPr>
+                    <pic:cNvPr id="156460100" name=""/>
+                    <pic:cNvPicPr/>
+                  </pic:nvPicPr>
+                  <pic:blipFill>
+                    <a:blip r:embed="rId8"/>
+                    <a:stretch>
+                      <a:fillRect/>
+                    </a:stretch>
+                  </pic:blipFill>
+                  <pic:spPr>
+                    <a:xfrm>
+                      <a:off x="0" y="0"/>
+                      <a:ext cx="5943600" cy="2313940"/>
+                    </a:xfrm>
+                    <a:prstGeom prst="rect">
+                      <a:avLst/>
+                    </a:prstGeom>
+                  </pic:spPr>
+                </pic:pic>
+              </a:graphicData>
+            </a:graphic>
+          </wp:inline>
+        </w:drawing>
+      </w:r>
+    </w:p>
+    <w:p>
+      <w:pPr>
+        <w:pStyle w:val="ListParagraph"/>
+        <w:widowControl/>
+        <w:numPr>
+          <w:ilvl w:val="0"/>
+          <w:numId w:val="9"/>
+        </w:numPr>
+        <w:autoSpaceDE/>
+        <w:autoSpaceDN/>
+        <w:spacing w:before="100" w:beforeAutospacing="1" w:after="100" w:afterAutospacing="1"/>
+        <w:jc w:val="both"/>
+        <w:outlineLvl w:val="2"/>
+        <w:rPr>
+          <w:rFonts w:eastAsia="Times New Roman" w:cs="Times New Roman"/>
+          <w:b/>
+          <w:bCs/>
+          <w:kern w:val="0"/>
+          <w:sz w:val="27"/>
+          <w:szCs w:val="27"/>
+          <w14:ligatures w14:val="none"/>
+        </w:rPr>
+      </w:pPr>
+      <w:r>
+        <w:rPr>
+          <w:rFonts w:eastAsia="Times New Roman" w:cs="Times New Roman"/>
+          <w:kern w:val="0"/>
+          <w:szCs w:val="24"/>
+          <w14:ligatures w14:val="none"/>
+        </w:rPr>
+        <w:lastRenderedPageBreak/>
+        <w:t>Trimiterea unui mesaj text de la client la server</w:t>
+      </w:r>
+      <w:r>
+        <w:rPr>
+          <w:rFonts w:eastAsia="Times New Roman" w:cs="Times New Roman"/>
+          <w:kern w:val="0"/>
+          <w:szCs w:val="24"/>
+          <w14:ligatures w14:val="none"/>
+        </w:rPr>
+        <w:t>:</w:t>
+      </w:r>
+      <w:r>
+        <w:rPr>
+          <w:rFonts w:eastAsia="Times New Roman" w:cs="Times New Roman"/>
+          <w:b/>
+          <w:bCs/>
+          <w:kern w:val="0"/>
+          <w:szCs w:val="24"/>
+          <w14:ligatures w14:val="none"/>
+        </w:rPr>
+        <w:t xml:space="preserve"> </w:t>
+      </w:r>
+      <w:r>
+        <w:rPr>
+          <w:rFonts w:eastAsia="Times New Roman" w:cs="Times New Roman"/>
+          <w:kern w:val="0"/>
+          <w:szCs w:val="24"/>
+          <w14:ligatures w14:val="none"/>
+        </w:rPr>
+        <w:t>Atunci când utilizatorul introduce un mesaj și apasă pe butonul de trimitere, mesajul este transmis serverului.</w:t>
+      </w:r>
+      <w:r>
+        <w:rPr>
+          <w:noProof/>
+        </w:rPr>
+        <w:t xml:space="preserve"> </w:t>
+      </w:r>
+      <w:r>
+        <w:rPr>
+          <w:rFonts w:eastAsia="Times New Roman" w:cs="Times New Roman"/>
+          <w:kern w:val="0"/>
+          <w:szCs w:val="24"/>
+          <w14:ligatures w14:val="none"/>
+        </w:rPr>
+        <w:drawing>
+          <wp:inline distT="0" distB="0" distL="0" distR="0" wp14:anchorId="58098F1D" wp14:editId="104C8E58">
+            <wp:extent cx="5943600" cy="2004060"/>
+            <wp:effectExtent l="0" t="0" r="0" b="0"/>
+            <wp:docPr id="1385364739" name="Picture 1"/>
+            <wp:cNvGraphicFramePr>
+              <a:graphicFrameLocks xmlns:a="http://schemas.openxmlformats.org/drawingml/2006/main" noChangeAspect="1"/>
+            </wp:cNvGraphicFramePr>
+            <a:graphic xmlns:a="http://schemas.openxmlformats.org/drawingml/2006/main">
+              <a:graphicData uri="http://schemas.openxmlformats.org/drawingml/2006/picture">
+                <pic:pic xmlns:pic="http://schemas.openxmlformats.org/drawingml/2006/picture">
+                  <pic:nvPicPr>
+                    <pic:cNvPr id="1385364739" name=""/>
+                    <pic:cNvPicPr/>
+                  </pic:nvPicPr>
+                  <pic:blipFill>
+                    <a:blip r:embed="rId9"/>
+                    <a:stretch>
+                      <a:fillRect/>
+                    </a:stretch>
+                  </pic:blipFill>
+                  <pic:spPr>
+                    <a:xfrm>
+                      <a:off x="0" y="0"/>
+                      <a:ext cx="5943600" cy="2004060"/>
+                    </a:xfrm>
+                    <a:prstGeom prst="rect">
+                      <a:avLst/>
+                    </a:prstGeom>
+                  </pic:spPr>
+                </pic:pic>
+              </a:graphicData>
+            </a:graphic>
+          </wp:inline>
+        </w:drawing>
+      </w:r>
+    </w:p>
+    <w:p>
+      <w:pPr>
+        <w:pStyle w:val="ListParagraph"/>
+        <w:widowControl/>
+        <w:numPr>
+          <w:ilvl w:val="0"/>
+          <w:numId w:val="9"/>
+        </w:numPr>
+        <w:autoSpaceDE/>
+        <w:autoSpaceDN/>
+        <w:spacing w:before="100" w:beforeAutospacing="1" w:after="100" w:afterAutospacing="1"/>
+        <w:jc w:val="both"/>
+        <w:outlineLvl w:val="2"/>
+        <w:rPr>
+          <w:rFonts w:eastAsia="Times New Roman" w:cs="Times New Roman"/>
+          <w:kern w:val="0"/>
+          <w:szCs w:val="24"/>
+          <w14:ligatures w14:val="none"/>
+        </w:rPr>
+      </w:pPr>
+      <w:r>
+        <w:rPr>
+          <w:rFonts w:eastAsia="Times New Roman" w:cs="Times New Roman"/>
+          <w:kern w:val="0"/>
+          <w:szCs w:val="24"/>
+          <w14:ligatures w14:val="none"/>
+        </w:rPr>
+        <w:t>Gestionarea mesajelor pe server</w:t>
+      </w:r>
+      <w:r>
+        <w:rPr>
+          <w:rFonts w:eastAsia="Times New Roman" w:cs="Times New Roman"/>
+          <w:kern w:val="0"/>
+          <w:szCs w:val="24"/>
+          <w14:ligatures w14:val="none"/>
+        </w:rPr>
+        <w:t>:</w:t>
+      </w:r>
+      <w:r>
+        <w:rPr>
+          <w:rFonts w:eastAsia="Times New Roman" w:cs="Times New Roman"/>
+          <w:kern w:val="0"/>
+          <w:szCs w:val="24"/>
+          <w14:ligatures w14:val="none"/>
+        </w:rPr>
+        <w:t xml:space="preserve"> </w:t>
+      </w:r>
+      <w:r>
+        <w:rPr>
+          <w:rFonts w:eastAsia="Times New Roman" w:cs="Times New Roman"/>
+          <w:kern w:val="0"/>
+          <w:szCs w:val="24"/>
+          <w14:ligatures w14:val="none"/>
+        </w:rPr>
+        <w:t>Serverul primește mesajele trimise de client și le retransmite către toți ceilalți clienți.</w:t>
+      </w:r>
+      <w:r>
+        <w:rPr>
+          <w:noProof/>
+        </w:rPr>
+        <w:t xml:space="preserve"> </w:t>
+      </w:r>
+      <w:r>
+        <w:rPr>
+          <w:rFonts w:eastAsia="Times New Roman" w:cs="Times New Roman"/>
+          <w:kern w:val="0"/>
+          <w:szCs w:val="24"/>
+          <w14:ligatures w14:val="none"/>
+        </w:rPr>
+        <w:drawing>
+          <wp:inline distT="0" distB="0" distL="0" distR="0" wp14:anchorId="42ED04B0" wp14:editId="77C35D2B">
+            <wp:extent cx="5943600" cy="2106930"/>
+            <wp:effectExtent l="0" t="0" r="0" b="7620"/>
+            <wp:docPr id="13426449" name="Picture 1"/>
+            <wp:cNvGraphicFramePr>
+              <a:graphicFrameLocks xmlns:a="http://schemas.openxmlformats.org/drawingml/2006/main" noChangeAspect="1"/>
+            </wp:cNvGraphicFramePr>
+            <a:graphic xmlns:a="http://schemas.openxmlformats.org/drawingml/2006/main">
+              <a:graphicData uri="http://schemas.openxmlformats.org/drawingml/2006/picture">
+                <pic:pic xmlns:pic="http://schemas.openxmlformats.org/drawingml/2006/picture">
+                  <pic:nvPicPr>
+                    <pic:cNvPr id="13426449" name=""/>
+                    <pic:cNvPicPr/>
+                  </pic:nvPicPr>
+                  <pic:blipFill>
+                    <a:blip r:embed="rId10"/>
+                    <a:stretch>
+                      <a:fillRect/>
+                    </a:stretch>
+                  </pic:blipFill>
+                  <pic:spPr>
+                    <a:xfrm>
+                      <a:off x="0" y="0"/>
+                      <a:ext cx="5943600" cy="2106930"/>
+                    </a:xfrm>
+                    <a:prstGeom prst="rect">
+                      <a:avLst/>
+                    </a:prstGeom>
+                  </pic:spPr>
+                </pic:pic>
+              </a:graphicData>
+            </a:graphic>
+          </wp:inline>
+        </w:drawing>
+      </w:r>
+    </w:p>
+    <w:p>
+      <w:pPr>
+        <w:pStyle w:val="ListParagraph"/>
+        <w:widowControl/>
+        <w:numPr>
+          <w:ilvl w:val="1"/>
+          <w:numId w:val="9"/>
+        </w:numPr>
+        <w:autoSpaceDE/>
+        <w:autoSpaceDN/>
+        <w:jc w:val="both"/>
+        <w:rPr>
+          <w:rFonts w:eastAsia="Times New Roman" w:cs="Times New Roman"/>
+          <w:kern w:val="0"/>
+          <w:szCs w:val="24"/>
+          <w14:ligatures w14:val="none"/>
+        </w:rPr>
+      </w:pPr>
+      <w:r>
+        <w:rPr>
+          <w:rFonts w:eastAsia="Times New Roman" w:cs="Times New Roman"/>
+          <w:b/>
+          <w:bCs/>
+          <w:kern w:val="0"/>
+          <w:szCs w:val="24"/>
+          <w14:ligatures w14:val="none"/>
+        </w:rPr>
+        <w:t>Sincronizare (</w:t>
+      </w:r>
+      <w:r>
+        <w:rPr>
+          <w:rFonts w:ascii="Courier New" w:eastAsia="Times New Roman" w:hAnsi="Courier New" w:cs="Courier New"/>
+          <w:b/>
+          <w:bCs/>
+          <w:kern w:val="0"/>
+          <w:sz w:val="20"/>
+          <w:szCs w:val="20"/>
+          <w14:ligatures w14:val="none"/>
+        </w:rPr>
+        <w:t>synchronized</w:t>
+      </w:r>
+      <w:r>
+        <w:rPr>
+          <w:rFonts w:eastAsia="Times New Roman" w:cs="Times New Roman"/>
+          <w:b/>
+          <w:bCs/>
+          <w:kern w:val="0"/>
+          <w:szCs w:val="24"/>
+          <w14:ligatures w14:val="none"/>
+        </w:rPr>
+        <w:t>)</w:t>
+      </w:r>
+      <w:r>
+        <w:rPr>
+          <w:rFonts w:eastAsia="Times New Roman" w:cs="Times New Roman"/>
+          <w:kern w:val="0"/>
+          <w:szCs w:val="24"/>
+          <w14:ligatures w14:val="none"/>
+        </w:rPr>
+        <w:t>: Previne accesul concurent la lista de mesaje și la lista de clienți conectați.</w:t>
+      </w:r>
+    </w:p>
+    <w:p>
+      <w:pPr>
+        <w:pStyle w:val="ListParagraph"/>
+        <w:numPr>
+          <w:ilvl w:val="1"/>
+          <w:numId w:val="9"/>
+        </w:numPr>
+        <w:jc w:val="both"/>
+        <w:rPr>
+          <w:szCs w:val="24"/>
+        </w:rPr>
+      </w:pPr>
+      <w:r>
+        <w:rPr>
+          <w:rFonts w:eastAsia="Times New Roman" w:cs="Times New Roman"/>
+          <w:kern w:val="0"/>
+          <w:szCs w:val="24"/>
+          <w14:ligatures w14:val="none"/>
+        </w:rPr>
+        <w:t>Mesajele sunt salvate în istoricul conversațiilor (</w:t>
+      </w:r>
+      <w:r>
+        <w:rPr>
+          <w:rFonts w:ascii="Courier New" w:eastAsia="Times New Roman" w:hAnsi="Courier New" w:cs="Courier New"/>
+          <w:kern w:val="0"/>
+          <w:sz w:val="20"/>
+          <w:szCs w:val="20"/>
+          <w14:ligatures w14:val="none"/>
+        </w:rPr>
+        <w:t>chatHistory</w:t>
+      </w:r>
+      <w:r>
+        <w:rPr>
+          <w:rFonts w:eastAsia="Times New Roman" w:cs="Times New Roman"/>
+          <w:kern w:val="0"/>
+          <w:szCs w:val="24"/>
+          <w14:ligatures w14:val="none"/>
+        </w:rPr>
+        <w:t>) și transmise tuturor clienților, cu excepția expeditorului.</w:t>
+      </w:r>
+    </w:p>
+    <w:p>
+      <w:pPr>
+        <w:pStyle w:val="ListParagraph"/>
+        <w:numPr>
+          <w:ilvl w:val="0"/>
+          <w:numId w:val="9"/>
+        </w:numPr>
+        <w:jc w:val="both"/>
+        <w:rPr>
+          <w:szCs w:val="24"/>
+        </w:rPr>
+      </w:pPr>
+      <w:r>
+        <w:rPr>
+          <w:szCs w:val="24"/>
+        </w:rPr>
+        <w:t>Trimiterea comenzii Hiss</w:t>
+      </w:r>
+      <w:r>
+        <w:rPr>
+          <w:szCs w:val="24"/>
+        </w:rPr>
+        <w:t xml:space="preserve">: </w:t>
+      </w:r>
+      <w:r>
+        <w:rPr>
+          <w:szCs w:val="24"/>
+        </w:rPr>
+        <w:t xml:space="preserve">Comanda Hiss </w:t>
+      </w:r>
+      <w:r>
+        <w:rPr>
+          <w:szCs w:val="24"/>
+        </w:rPr>
+        <w:t xml:space="preserve">nu </w:t>
+      </w:r>
+      <w:r>
+        <w:rPr>
+          <w:szCs w:val="24"/>
+        </w:rPr>
+        <w:t>este tratată special: clientul o trimite către server, care o retransmite tuturor celorlalți clienți.</w:t>
+      </w:r>
+      <w:r>
+        <w:rPr>
+          <w:szCs w:val="24"/>
+        </w:rPr>
+        <w:t xml:space="preserve"> Insa </w:t>
+      </w:r>
+      <w:r>
+        <w:rPr>
+          <w:szCs w:val="24"/>
+        </w:rPr>
+        <w:t xml:space="preserve">folosește un mutex pentru </w:t>
+      </w:r>
+      <w:proofErr w:type="gramStart"/>
+      <w:r>
+        <w:rPr>
+          <w:szCs w:val="24"/>
+        </w:rPr>
+        <w:t>a</w:t>
+      </w:r>
+      <w:proofErr w:type="gramEnd"/>
+      <w:r>
+        <w:rPr>
+          <w:szCs w:val="24"/>
+        </w:rPr>
+        <w:t xml:space="preserve"> asigura că doar un fir poate procesa comanda la un moment dat.</w:t>
+      </w:r>
+    </w:p>
+    <w:p>
+      <w:pPr>
+        <w:pStyle w:val="ListParagraph"/>
+        <w:numPr>
+          <w:ilvl w:val="0"/>
+          <w:numId w:val="9"/>
+        </w:numPr>
+        <w:jc w:val="both"/>
+        <w:rPr>
+          <w:szCs w:val="24"/>
+        </w:rPr>
+      </w:pPr>
+      <w:r>
+        <w:rPr>
+          <w:szCs w:val="24"/>
+        </w:rPr>
+        <w:drawing>
+          <wp:inline distT="0" distB="0" distL="0" distR="0" wp14:anchorId="0D3F45BE" wp14:editId="3A59731C">
+            <wp:extent cx="5943600" cy="1800860"/>
+            <wp:effectExtent l="0" t="0" r="0" b="8890"/>
+            <wp:docPr id="1344077904" name="Picture 1"/>
+            <wp:cNvGraphicFramePr>
+              <a:graphicFrameLocks xmlns:a="http://schemas.openxmlformats.org/drawingml/2006/main" noChangeAspect="1"/>
+            </wp:cNvGraphicFramePr>
+            <a:graphic xmlns:a="http://schemas.openxmlformats.org/drawingml/2006/main">
+              <a:graphicData uri="http://schemas.openxmlformats.org/drawingml/2006/picture">
+                <pic:pic xmlns:pic="http://schemas.openxmlformats.org/drawingml/2006/picture">
+                  <pic:nvPicPr>
+                    <pic:cNvPr id="1344077904" name=""/>
+                    <pic:cNvPicPr/>
+                  </pic:nvPicPr>
+                  <pic:blipFill>
+                    <a:blip r:embed="rId11"/>
+                    <a:stretch>
+                      <a:fillRect/>
+                    </a:stretch>
+                  </pic:blipFill>
+                  <pic:spPr>
+                    <a:xfrm>
+                      <a:off x="0" y="0"/>
+                      <a:ext cx="5943600" cy="1800860"/>
+                    </a:xfrm>
+                    <a:prstGeom prst="rect">
+                      <a:avLst/>
+                    </a:prstGeom>
+                  </pic:spPr>
+                </pic:pic>
+              </a:graphicData>
+            </a:graphic>
+          </wp:inline>
+        </w:drawing>
+      </w:r>
+    </w:p>
+    <w:p>
+      <w:pPr>
         <w:pStyle w:val="H1"/>
         <w:jc w:val="both"/>
-      </w:pPr>
-      <w:r>
+        <w:rPr>
+          <w:bCs/>
+        </w:rPr>
+      </w:pPr>
+      <w:r>
+        <w:rPr>
+          <w:bCs/>
+        </w:rPr>
         <w:lastRenderedPageBreak/>
-        <w:t>5. Exemple de cod relevante</w:t>
-      </w:r>
-    </w:p>
-    <w:p>
-      <w:pPr>
-        <w:rPr>
-          <w:b/>
-          <w:bCs/>
-        </w:rPr>
-      </w:pPr>
-      <w:r>
-        <w:rPr>
-          <w:b/>
-          <w:bCs/>
-        </w:rPr>
-        <w:t>Trimiterea mesajelor de la client către server este realizată astfel:</w:t>
-      </w:r>
-    </w:p>
-    <w:p/>
-    <w:p>
-      <w:r>
-        <w:t xml:space="preserve">private void </w:t>
-      </w:r>
-      <w:proofErr w:type="gramStart"/>
-      <w:r>
-        <w:t>sendMessage(</w:t>
-      </w:r>
-      <w:proofErr w:type="gramEnd"/>
-      <w:r>
-        <w:t>) {</w:t>
-      </w:r>
-    </w:p>
-    <w:p>
-      <w:r>
-        <w:t xml:space="preserve">    String message = messageField.getText(</w:t>
-      </w:r>
-      <w:proofErr w:type="gramStart"/>
-      <w:r>
-        <w:t>).trim</w:t>
-      </w:r>
-      <w:proofErr w:type="gramEnd"/>
-      <w:r>
-        <w:t>();</w:t>
-      </w:r>
-    </w:p>
-    <w:p>
-      <w:r>
-        <w:t xml:space="preserve">    if </w:t>
-      </w:r>
-      <w:proofErr w:type="gramStart"/>
-      <w:r>
-        <w:t>(!message</w:t>
-      </w:r>
-      <w:proofErr w:type="gramEnd"/>
-      <w:r>
-        <w:t>.isEmpty()) {</w:t>
-      </w:r>
-    </w:p>
-    <w:p>
-      <w:r>
-        <w:t xml:space="preserve">        </w:t>
-      </w:r>
-      <w:proofErr w:type="gramStart"/>
-      <w:r>
-        <w:t>out.println</w:t>
-      </w:r>
-      <w:proofErr w:type="gramEnd"/>
-      <w:r>
-        <w:t>(message);</w:t>
-      </w:r>
-    </w:p>
-    <w:p>
-      <w:r>
-        <w:t xml:space="preserve">        if (</w:t>
-      </w:r>
-      <w:proofErr w:type="gramStart"/>
-      <w:r>
-        <w:t>clientName !</w:t>
-      </w:r>
-      <w:proofErr w:type="gramEnd"/>
-      <w:r>
-        <w:t>= null) {</w:t>
-      </w:r>
-    </w:p>
-    <w:p>
-      <w:r>
-        <w:t xml:space="preserve">            chatArea.append("You: " + message + "\n");</w:t>
-      </w:r>
-    </w:p>
-    <w:p>
-      <w:r>
-        <w:t xml:space="preserve">        }</w:t>
-      </w:r>
-    </w:p>
-    <w:p>
-      <w:r>
-        <w:t xml:space="preserve">        messageField.setText("");</w:t>
-      </w:r>
-    </w:p>
-    <w:p>
-      <w:r>
-        <w:t xml:space="preserve">    }</w:t>
-      </w:r>
-    </w:p>
-    <w:p>
-      <w:r>
-        <w:t>}</w:t>
-      </w:r>
-    </w:p>
-    <w:p>
-      <w:pPr>
-        <w:rPr>
-          <w:b/>
-          <w:bCs/>
-        </w:rPr>
-      </w:pPr>
-      <w:r>
-        <w:rPr>
-          <w:b/>
-          <w:bCs/>
-        </w:rPr>
-        <w:t>Pe partea serverului, mesajele sunt transmise tuturor clienților conectați folosind următorul cod:</w:t>
-      </w:r>
-    </w:p>
-    <w:p>
-      <w:pPr>
-        <w:rPr>
-          <w:b/>
-          <w:bCs/>
-        </w:rPr>
-      </w:pPr>
-    </w:p>
-    <w:p>
-      <w:r>
-        <w:t xml:space="preserve">public static void </w:t>
-      </w:r>
-      <w:proofErr w:type="gramStart"/>
-      <w:r>
-        <w:t>broadcastMessage(</w:t>
-      </w:r>
-      <w:proofErr w:type="gramEnd"/>
-      <w:r>
-        <w:t>Message message, ClientHandler sender) {</w:t>
-      </w:r>
-    </w:p>
-    <w:p>
-      <w:r>
-        <w:t xml:space="preserve">    synchronized (chatHistory) {</w:t>
-      </w:r>
-    </w:p>
-    <w:p>
-      <w:r>
-        <w:t xml:space="preserve">        chatHistory.add(message);</w:t>
-      </w:r>
-    </w:p>
-    <w:p>
-      <w:r>
-        <w:t xml:space="preserve">    }</w:t>
-      </w:r>
-    </w:p>
-    <w:p>
-      <w:r>
-        <w:t xml:space="preserve">    </w:t>
-      </w:r>
-      <w:proofErr w:type="gramStart"/>
-      <w:r>
-        <w:t>saveChatHistory(</w:t>
-      </w:r>
-      <w:proofErr w:type="gramEnd"/>
-      <w:r>
-        <w:t>);</w:t>
-      </w:r>
-    </w:p>
-    <w:p/>
-    <w:p>
-      <w:r>
-        <w:t xml:space="preserve">    synchronized (clientHandlers) {</w:t>
-      </w:r>
-    </w:p>
-    <w:p>
-      <w:r>
-        <w:t xml:space="preserve">        for (ClientHandler </w:t>
-      </w:r>
-      <w:proofErr w:type="gramStart"/>
-      <w:r>
-        <w:t>clientHandler :</w:t>
-      </w:r>
-      <w:proofErr w:type="gramEnd"/>
-      <w:r>
-        <w:t xml:space="preserve"> clientHandlers) {</w:t>
-      </w:r>
-    </w:p>
-    <w:p>
-      <w:r>
-        <w:t xml:space="preserve">            if (</w:t>
-      </w:r>
-      <w:proofErr w:type="gramStart"/>
-      <w:r>
-        <w:t>clientHandler !</w:t>
-      </w:r>
-      <w:proofErr w:type="gramEnd"/>
-      <w:r>
-        <w:t>= sender) {</w:t>
-      </w:r>
-    </w:p>
-    <w:p>
-      <w:r>
-        <w:t xml:space="preserve">                clientHandler.sendMessage(</w:t>
-      </w:r>
-      <w:proofErr w:type="gramStart"/>
-      <w:r>
-        <w:t>message.toString</w:t>
-      </w:r>
-      <w:proofErr w:type="gramEnd"/>
-      <w:r>
-        <w:t>());</w:t>
-      </w:r>
-    </w:p>
-    <w:p>
-      <w:r>
-        <w:t xml:space="preserve">            }</w:t>
-      </w:r>
-    </w:p>
-    <w:p>
-      <w:r>
-        <w:t xml:space="preserve">        }</w:t>
-      </w:r>
-    </w:p>
-    <w:p>
-      <w:r>
-        <w:t xml:space="preserve">    }</w:t>
-      </w:r>
-    </w:p>
-    <w:p>
-      <w:r>
-        <w:t>}</w:t>
-      </w:r>
-    </w:p>
-    <w:p>
-      <w:pPr>
-        <w:pStyle w:val="H1"/>
-        <w:jc w:val="both"/>
-        <w:rPr>
-          <w:bCs/>
-        </w:rPr>
-      </w:pPr>
-      <w:r>
-        <w:rPr>
-          <w:bCs/>
-        </w:rPr>
         <w:t>6. Concluzii</w:t>
       </w:r>
     </w:p>
@@ -403,6 +785,7 @@
     </w:p>
     <w:p/>
     <w:sectPr>
+      <w:headerReference w:type="default" r:id="rId12"/>
       <w:pgSz w:w="12240" w:h="15840"/>
       <w:pgMar w:top="1440" w:right="1440" w:bottom="1440" w:left="1440" w:header="708" w:footer="708" w:gutter="0"/>
       <w:cols w:space="708"/>
@@ -450,6 +833,27 @@
 </w:footnotes>
 </file>
 
+<file path=word/header1.xml><?xml version="1.0" encoding="utf-8"?>
+<w:hdr xmlns:wpc="http://schemas.microsoft.com/office/word/2010/wordprocessingCanvas" xmlns:cx="http://schemas.microsoft.com/office/drawing/2014/chartex" xmlns:cx1="http://schemas.microsoft.com/office/drawing/2015/9/8/chartex" xmlns:cx2="http://schemas.microsoft.com/office/drawing/2015/10/21/chartex" xmlns:cx3="http://schemas.microsoft.com/office/drawing/2016/5/9/chartex" xmlns:cx4="http://schemas.microsoft.com/office/drawing/2016/5/10/chartex" xmlns:cx5="http://schemas.microsoft.com/office/drawing/2016/5/11/chartex" xmlns:cx6="http://schemas.microsoft.com/office/drawing/2016/5/12/chartex" xmlns:cx7="http://schemas.microsoft.com/office/drawing/2016/5/13/chartex" xmlns:cx8="http://schemas.microsoft.com/office/drawing/2016/5/14/chartex" xmlns:mc="http://schemas.openxmlformats.org/markup-compatibility/2006" xmlns:aink="http://schemas.microsoft.com/office/drawing/2016/ink" xmlns:am3d="http://schemas.microsoft.com/office/drawing/2017/model3d" xmlns:o="urn:schemas-microsoft-com:office:office" xmlns:oel="http://schemas.microsoft.com/office/2019/extlst" xmlns:r="http://schemas.openxmlformats.org/officeDocument/2006/relationships" xmlns:m="http://schemas.openxmlformats.org/officeDocument/2006/math" xmlns:v="urn:schemas-microsoft-com:vml" xmlns:wp14="http://schemas.microsoft.com/office/word/2010/wordprocessingDrawing" xmlns:wp="http://schemas.openxmlformats.org/drawingml/2006/wordprocessingDrawing" xmlns:w10="urn:schemas-microsoft-com:office:word" xmlns:w="http://schemas.openxmlformats.org/wordprocessingml/2006/main" xmlns:w14="http://schemas.microsoft.com/office/word/2010/wordml" xmlns:w15="http://schemas.microsoft.com/office/word/2012/wordml" xmlns:w16cex="http://schemas.microsoft.com/office/word/2018/wordml/cex" xmlns:w16cid="http://schemas.microsoft.com/office/word/2016/wordml/cid" xmlns:w16="http://schemas.microsoft.com/office/word/2018/wordml" xmlns:w16du="http://schemas.microsoft.com/office/word/2023/wordml/word16du" xmlns:w16sdtdh="http://schemas.microsoft.com/office/word/2020/wordml/sdtdatahash" xmlns:w16sdtfl="http://schemas.microsoft.com/office/word/2024/wordml/sdtformatlock" xmlns:w16se="http://schemas.microsoft.com/office/word/2015/wordml/symex" xmlns:wpg="http://schemas.microsoft.com/office/word/2010/wordprocessingGroup" xmlns:wpi="http://schemas.microsoft.com/office/word/2010/wordprocessingInk" xmlns:wne="http://schemas.microsoft.com/office/word/2006/wordml" xmlns:wps="http://schemas.microsoft.com/office/word/2010/wordprocessingShape" mc:Ignorable="w14 w15 w16se w16cid w16 w16cex w16sdtdh w16sdtfl w16du wp14">
+  <w:p>
+    <w:pPr>
+      <w:pStyle w:val="Header"/>
+    </w:pPr>
+    <w:r>
+      <w:t>Programare Web Utilizand JAVA</w:t>
+    </w:r>
+  </w:p>
+  <w:p>
+    <w:pPr>
+      <w:pStyle w:val="Header"/>
+    </w:pPr>
+    <w:r>
+      <w:t>Ion Apelia-Cosmina (BDTS IFR)</w:t>
+    </w:r>
+  </w:p>
+</w:hdr>
+</file>
+
 <file path=word/numbering.xml><?xml version="1.0" encoding="utf-8"?>
 <w:numbering xmlns:wpc="http://schemas.microsoft.com/office/word/2010/wordprocessingCanvas" xmlns:cx="http://schemas.microsoft.com/office/drawing/2014/chartex" xmlns:cx1="http://schemas.microsoft.com/office/drawing/2015/9/8/chartex" xmlns:cx2="http://schemas.microsoft.com/office/drawing/2015/10/21/chartex" xmlns:cx3="http://schemas.microsoft.com/office/drawing/2016/5/9/chartex" xmlns:cx4="http://schemas.microsoft.com/office/drawing/2016/5/10/chartex" xmlns:cx5="http://schemas.microsoft.com/office/drawing/2016/5/11/chartex" xmlns:cx6="http://schemas.microsoft.com/office/drawing/2016/5/12/chartex" xmlns:cx7="http://schemas.microsoft.com/office/drawing/2016/5/13/chartex" xmlns:cx8="http://schemas.microsoft.com/office/drawing/2016/5/14/chartex" xmlns:mc="http://schemas.openxmlformats.org/markup-compatibility/2006" xmlns:aink="http://schemas.microsoft.com/office/drawing/2016/ink" xmlns:am3d="http://schemas.microsoft.com/office/drawing/2017/model3d" xmlns:o="urn:schemas-microsoft-com:office:office" xmlns:oel="http://schemas.microsoft.com/office/2019/extlst" xmlns:r="http://schemas.openxmlformats.org/officeDocument/2006/relationships" xmlns:m="http://schemas.openxmlformats.org/officeDocument/2006/math" xmlns:v="urn:schemas-microsoft-com:vml" xmlns:wp14="http://schemas.microsoft.com/office/word/2010/wordprocessingDrawing" xmlns:wp="http://schemas.openxmlformats.org/drawingml/2006/wordprocessingDrawing" xmlns:w10="urn:schemas-microsoft-com:office:word" xmlns:w="http://schemas.openxmlformats.org/wordprocessingml/2006/main" xmlns:w14="http://schemas.microsoft.com/office/word/2010/wordml" xmlns:w15="http://schemas.microsoft.com/office/word/2012/wordml" xmlns:w16cex="http://schemas.microsoft.com/office/word/2018/wordml/cex" xmlns:w16cid="http://schemas.microsoft.com/office/word/2016/wordml/cid" xmlns:w16="http://schemas.microsoft.com/office/word/2018/wordml" xmlns:w16du="http://schemas.microsoft.com/office/word/2023/wordml/word16du" xmlns:w16sdtdh="http://schemas.microsoft.com/office/word/2020/wordml/sdtdatahash" xmlns:w16sdtfl="http://schemas.microsoft.com/office/word/2024/wordml/sdtformatlock" xmlns:w16se="http://schemas.microsoft.com/office/word/2015/wordml/symex" xmlns:wpg="http://schemas.microsoft.com/office/word/2010/wordprocessingGroup" xmlns:wpi="http://schemas.microsoft.com/office/word/2010/wordprocessingInk" xmlns:wne="http://schemas.microsoft.com/office/word/2006/wordml" xmlns:wps="http://schemas.microsoft.com/office/word/2010/wordprocessingShape" mc:Ignorable="w14 w15 w16se w16cid w16 w16cex w16sdtdh w16sdtfl w16du wp14">
   <w:abstractNum w:abstractNumId="0" w15:restartNumberingAfterBreak="0">
@@ -840,6 +1244,119 @@
     </w:lvl>
   </w:abstractNum>
   <w:abstractNum w:abstractNumId="3" w15:restartNumberingAfterBreak="0">
+    <w:nsid w:val="4B454F6C"/>
+    <w:multiLevelType w:val="hybridMultilevel"/>
+    <w:tmpl w:val="6F744834"/>
+    <w:lvl w:ilvl="0" w:tplc="04090001">
+      <w:start w:val="1"/>
+      <w:numFmt w:val="bullet"/>
+      <w:lvlText w:val=""/>
+      <w:lvlJc w:val="left"/>
+      <w:pPr>
+        <w:ind w:left="720" w:hanging="360"/>
+      </w:pPr>
+      <w:rPr>
+        <w:rFonts w:ascii="Symbol" w:hAnsi="Symbol" w:hint="default"/>
+      </w:rPr>
+    </w:lvl>
+    <w:lvl w:ilvl="1" w:tplc="04090003" w:tentative="1">
+      <w:start w:val="1"/>
+      <w:numFmt w:val="bullet"/>
+      <w:lvlText w:val="o"/>
+      <w:lvlJc w:val="left"/>
+      <w:pPr>
+        <w:ind w:left="1440" w:hanging="360"/>
+      </w:pPr>
+      <w:rPr>
+        <w:rFonts w:ascii="Courier New" w:hAnsi="Courier New" w:cs="Courier New" w:hint="default"/>
+      </w:rPr>
+    </w:lvl>
+    <w:lvl w:ilvl="2" w:tplc="04090005" w:tentative="1">
+      <w:start w:val="1"/>
+      <w:numFmt w:val="bullet"/>
+      <w:lvlText w:val=""/>
+      <w:lvlJc w:val="left"/>
+      <w:pPr>
+        <w:ind w:left="2160" w:hanging="360"/>
+      </w:pPr>
+      <w:rPr>
+        <w:rFonts w:ascii="Wingdings" w:hAnsi="Wingdings" w:hint="default"/>
+      </w:rPr>
+    </w:lvl>
+    <w:lvl w:ilvl="3" w:tplc="04090001" w:tentative="1">
+      <w:start w:val="1"/>
+      <w:numFmt w:val="bullet"/>
+      <w:lvlText w:val=""/>
+      <w:lvlJc w:val="left"/>
+      <w:pPr>
+        <w:ind w:left="2880" w:hanging="360"/>
+      </w:pPr>
+      <w:rPr>
+        <w:rFonts w:ascii="Symbol" w:hAnsi="Symbol" w:hint="default"/>
+      </w:rPr>
+    </w:lvl>
+    <w:lvl w:ilvl="4" w:tplc="04090003" w:tentative="1">
+      <w:start w:val="1"/>
+      <w:numFmt w:val="bullet"/>
+      <w:lvlText w:val="o"/>
+      <w:lvlJc w:val="left"/>
+      <w:pPr>
+        <w:ind w:left="3600" w:hanging="360"/>
+      </w:pPr>
+      <w:rPr>
+        <w:rFonts w:ascii="Courier New" w:hAnsi="Courier New" w:cs="Courier New" w:hint="default"/>
+      </w:rPr>
+    </w:lvl>
+    <w:lvl w:ilvl="5" w:tplc="04090005" w:tentative="1">
+      <w:start w:val="1"/>
+      <w:numFmt w:val="bullet"/>
+      <w:lvlText w:val=""/>
+      <w:lvlJc w:val="left"/>
+      <w:pPr>
+        <w:ind w:left="4320" w:hanging="360"/>
+      </w:pPr>
+      <w:rPr>
+        <w:rFonts w:ascii="Wingdings" w:hAnsi="Wingdings" w:hint="default"/>
+      </w:rPr>
+    </w:lvl>
+    <w:lvl w:ilvl="6" w:tplc="04090001" w:tentative="1">
+      <w:start w:val="1"/>
+      <w:numFmt w:val="bullet"/>
+      <w:lvlText w:val=""/>
+      <w:lvlJc w:val="left"/>
+      <w:pPr>
+        <w:ind w:left="5040" w:hanging="360"/>
+      </w:pPr>
+      <w:rPr>
+        <w:rFonts w:ascii="Symbol" w:hAnsi="Symbol" w:hint="default"/>
+      </w:rPr>
+    </w:lvl>
+    <w:lvl w:ilvl="7" w:tplc="04090003" w:tentative="1">
+      <w:start w:val="1"/>
+      <w:numFmt w:val="bullet"/>
+      <w:lvlText w:val="o"/>
+      <w:lvlJc w:val="left"/>
+      <w:pPr>
+        <w:ind w:left="5760" w:hanging="360"/>
+      </w:pPr>
+      <w:rPr>
+        <w:rFonts w:ascii="Courier New" w:hAnsi="Courier New" w:cs="Courier New" w:hint="default"/>
+      </w:rPr>
+    </w:lvl>
+    <w:lvl w:ilvl="8" w:tplc="04090005" w:tentative="1">
+      <w:start w:val="1"/>
+      <w:numFmt w:val="bullet"/>
+      <w:lvlText w:val=""/>
+      <w:lvlJc w:val="left"/>
+      <w:pPr>
+        <w:ind w:left="6480" w:hanging="360"/>
+      </w:pPr>
+      <w:rPr>
+        <w:rFonts w:ascii="Wingdings" w:hAnsi="Wingdings" w:hint="default"/>
+      </w:rPr>
+    </w:lvl>
+  </w:abstractNum>
+  <w:abstractNum w:abstractNumId="4" w15:restartNumberingAfterBreak="0">
     <w:nsid w:val="552114DB"/>
     <w:multiLevelType w:val="multilevel"/>
     <w:tmpl w:val="8E7CAE2C"/>
@@ -956,7 +1473,7 @@
       </w:pPr>
     </w:lvl>
   </w:abstractNum>
-  <w:abstractNum w:abstractNumId="4" w15:restartNumberingAfterBreak="0">
+  <w:abstractNum w:abstractNumId="5" w15:restartNumberingAfterBreak="0">
     <w:nsid w:val="65B0652B"/>
     <w:multiLevelType w:val="multilevel"/>
     <w:tmpl w:val="DEECC056"/>
@@ -1073,7 +1590,120 @@
       </w:pPr>
     </w:lvl>
   </w:abstractNum>
-  <w:abstractNum w:abstractNumId="5" w15:restartNumberingAfterBreak="0">
+  <w:abstractNum w:abstractNumId="6" w15:restartNumberingAfterBreak="0">
+    <w:nsid w:val="710947B2"/>
+    <w:multiLevelType w:val="hybridMultilevel"/>
+    <w:tmpl w:val="95926CA0"/>
+    <w:lvl w:ilvl="0" w:tplc="04090001">
+      <w:start w:val="1"/>
+      <w:numFmt w:val="bullet"/>
+      <w:lvlText w:val=""/>
+      <w:lvlJc w:val="left"/>
+      <w:pPr>
+        <w:ind w:left="720" w:hanging="360"/>
+      </w:pPr>
+      <w:rPr>
+        <w:rFonts w:ascii="Symbol" w:hAnsi="Symbol" w:hint="default"/>
+      </w:rPr>
+    </w:lvl>
+    <w:lvl w:ilvl="1" w:tplc="04090003">
+      <w:start w:val="1"/>
+      <w:numFmt w:val="bullet"/>
+      <w:lvlText w:val="o"/>
+      <w:lvlJc w:val="left"/>
+      <w:pPr>
+        <w:ind w:left="1440" w:hanging="360"/>
+      </w:pPr>
+      <w:rPr>
+        <w:rFonts w:ascii="Courier New" w:hAnsi="Courier New" w:cs="Courier New" w:hint="default"/>
+      </w:rPr>
+    </w:lvl>
+    <w:lvl w:ilvl="2" w:tplc="04090005" w:tentative="1">
+      <w:start w:val="1"/>
+      <w:numFmt w:val="bullet"/>
+      <w:lvlText w:val=""/>
+      <w:lvlJc w:val="left"/>
+      <w:pPr>
+        <w:ind w:left="2160" w:hanging="360"/>
+      </w:pPr>
+      <w:rPr>
+        <w:rFonts w:ascii="Wingdings" w:hAnsi="Wingdings" w:hint="default"/>
+      </w:rPr>
+    </w:lvl>
+    <w:lvl w:ilvl="3" w:tplc="04090001" w:tentative="1">
+      <w:start w:val="1"/>
+      <w:numFmt w:val="bullet"/>
+      <w:lvlText w:val=""/>
+      <w:lvlJc w:val="left"/>
+      <w:pPr>
+        <w:ind w:left="2880" w:hanging="360"/>
+      </w:pPr>
+      <w:rPr>
+        <w:rFonts w:ascii="Symbol" w:hAnsi="Symbol" w:hint="default"/>
+      </w:rPr>
+    </w:lvl>
+    <w:lvl w:ilvl="4" w:tplc="04090003" w:tentative="1">
+      <w:start w:val="1"/>
+      <w:numFmt w:val="bullet"/>
+      <w:lvlText w:val="o"/>
+      <w:lvlJc w:val="left"/>
+      <w:pPr>
+        <w:ind w:left="3600" w:hanging="360"/>
+      </w:pPr>
+      <w:rPr>
+        <w:rFonts w:ascii="Courier New" w:hAnsi="Courier New" w:cs="Courier New" w:hint="default"/>
+      </w:rPr>
+    </w:lvl>
+    <w:lvl w:ilvl="5" w:tplc="04090005" w:tentative="1">
+      <w:start w:val="1"/>
+      <w:numFmt w:val="bullet"/>
+      <w:lvlText w:val=""/>
+      <w:lvlJc w:val="left"/>
+      <w:pPr>
+        <w:ind w:left="4320" w:hanging="360"/>
+      </w:pPr>
+      <w:rPr>
+        <w:rFonts w:ascii="Wingdings" w:hAnsi="Wingdings" w:hint="default"/>
+      </w:rPr>
+    </w:lvl>
+    <w:lvl w:ilvl="6" w:tplc="04090001" w:tentative="1">
+      <w:start w:val="1"/>
+      <w:numFmt w:val="bullet"/>
+      <w:lvlText w:val=""/>
+      <w:lvlJc w:val="left"/>
+      <w:pPr>
+        <w:ind w:left="5040" w:hanging="360"/>
+      </w:pPr>
+      <w:rPr>
+        <w:rFonts w:ascii="Symbol" w:hAnsi="Symbol" w:hint="default"/>
+      </w:rPr>
+    </w:lvl>
+    <w:lvl w:ilvl="7" w:tplc="04090003" w:tentative="1">
+      <w:start w:val="1"/>
+      <w:numFmt w:val="bullet"/>
+      <w:lvlText w:val="o"/>
+      <w:lvlJc w:val="left"/>
+      <w:pPr>
+        <w:ind w:left="5760" w:hanging="360"/>
+      </w:pPr>
+      <w:rPr>
+        <w:rFonts w:ascii="Courier New" w:hAnsi="Courier New" w:cs="Courier New" w:hint="default"/>
+      </w:rPr>
+    </w:lvl>
+    <w:lvl w:ilvl="8" w:tplc="04090005" w:tentative="1">
+      <w:start w:val="1"/>
+      <w:numFmt w:val="bullet"/>
+      <w:lvlText w:val=""/>
+      <w:lvlJc w:val="left"/>
+      <w:pPr>
+        <w:ind w:left="6480" w:hanging="360"/>
+      </w:pPr>
+      <w:rPr>
+        <w:rFonts w:ascii="Wingdings" w:hAnsi="Wingdings" w:hint="default"/>
+      </w:rPr>
+    </w:lvl>
+  </w:abstractNum>
+  <w:abstractNum w:abstractNumId="7" w15:restartNumberingAfterBreak="0">
     <w:nsid w:val="74EC4990"/>
     <w:multiLevelType w:val="multilevel"/>
     <w:tmpl w:val="D996C7EC"/>
@@ -1222,7 +1852,7 @@
       </w:rPr>
     </w:lvl>
   </w:abstractNum>
-  <w:abstractNum w:abstractNumId="6" w15:restartNumberingAfterBreak="0">
+  <w:abstractNum w:abstractNumId="8" w15:restartNumberingAfterBreak="0">
     <w:nsid w:val="767655E0"/>
     <w:multiLevelType w:val="multilevel"/>
     <w:tmpl w:val="761454AC"/>
@@ -1372,7 +2002,7 @@
     </w:lvl>
   </w:abstractNum>
   <w:num w:numId="1" w16cid:durableId="1848591740">
-    <w:abstractNumId w:val="6"/>
+    <w:abstractNumId w:val="8"/>
   </w:num>
   <w:num w:numId="2" w16cid:durableId="847670642">
     <w:abstractNumId w:val="0"/>
@@ -1381,16 +2011,22 @@
     <w:abstractNumId w:val="1"/>
   </w:num>
   <w:num w:numId="4" w16cid:durableId="815033068">
-    <w:abstractNumId w:val="3"/>
+    <w:abstractNumId w:val="4"/>
   </w:num>
   <w:num w:numId="5" w16cid:durableId="432408095">
-    <w:abstractNumId w:val="4"/>
+    <w:abstractNumId w:val="5"/>
   </w:num>
   <w:num w:numId="6" w16cid:durableId="1974046">
     <w:abstractNumId w:val="2"/>
   </w:num>
   <w:num w:numId="7" w16cid:durableId="617838912">
-    <w:abstractNumId w:val="5"/>
+    <w:abstractNumId w:val="7"/>
+  </w:num>
+  <w:num w:numId="8" w16cid:durableId="130294120">
+    <w:abstractNumId w:val="3"/>
+  </w:num>
+  <w:num w:numId="9" w16cid:durableId="256989516">
+    <w:abstractNumId w:val="6"/>
   </w:num>
 </w:numbering>
 </file>
@@ -1857,7 +2493,6 @@
     <w:next w:val="Normal"/>
     <w:link w:val="Heading3Char"/>
     <w:uiPriority w:val="9"/>
-    <w:semiHidden/>
     <w:unhideWhenUsed/>
     <w:qFormat/>
     <w:rsid w:val="00442648"/>
@@ -2113,7 +2748,6 @@
     <w:basedOn w:val="DefaultParagraphFont"/>
     <w:link w:val="Heading3"/>
     <w:uiPriority w:val="9"/>
-    <w:semiHidden/>
     <w:rsid w:val="00442648"/>
     <w:rPr>
       <w:rFonts w:eastAsiaTheme="majorEastAsia" w:cstheme="majorBidi"/>
@@ -2439,6 +3073,50 @@
     <w:semiHidden/>
     <w:unhideWhenUsed/>
     <w:rsid w:val="00A519BD"/>
+  </w:style>
+  <w:style w:type="character" w:styleId="Strong">
+    <w:name w:val="Strong"/>
+    <w:basedOn w:val="DefaultParagraphFont"/>
+    <w:uiPriority w:val="22"/>
+    <w:qFormat/>
+    <w:rsid w:val="00957680"/>
+    <w:rPr>
+      <w:b/>
+      <w:bCs/>
+    </w:rPr>
+  </w:style>
+  <w:style w:type="paragraph" w:styleId="NormalWeb">
+    <w:name w:val="Normal (Web)"/>
+    <w:basedOn w:val="Normal"/>
+    <w:uiPriority w:val="99"/>
+    <w:semiHidden/>
+    <w:unhideWhenUsed/>
+    <w:rsid w:val="00957680"/>
+    <w:pPr>
+      <w:widowControl/>
+      <w:autoSpaceDE/>
+      <w:autoSpaceDN/>
+      <w:spacing w:before="100" w:beforeAutospacing="1" w:after="100" w:afterAutospacing="1"/>
+    </w:pPr>
+    <w:rPr>
+      <w:rFonts w:eastAsia="Times New Roman" w:cs="Times New Roman"/>
+      <w:kern w:val="0"/>
+      <w:szCs w:val="24"/>
+      <w14:ligatures w14:val="none"/>
+    </w:rPr>
+  </w:style>
+  <w:style w:type="character" w:styleId="HTMLCode">
+    <w:name w:val="HTML Code"/>
+    <w:basedOn w:val="DefaultParagraphFont"/>
+    <w:uiPriority w:val="99"/>
+    <w:semiHidden/>
+    <w:unhideWhenUsed/>
+    <w:rsid w:val="004179F1"/>
+    <w:rPr>
+      <w:rFonts w:ascii="Courier New" w:eastAsia="Times New Roman" w:hAnsi="Courier New" w:cs="Courier New"/>
+      <w:sz w:val="20"/>
+      <w:szCs w:val="20"/>
+    </w:rPr>
   </w:style>
 </w:styles>
 </file>

</xml_diff>